<commit_message>
submitted the paper in SN Computer Science Journal
</commit_message>
<xml_diff>
--- a/final paper/IEEE_RAG_FORMATTED.docx
+++ b/final paper/IEEE_RAG_FORMATTED.docx
@@ -1935,14 +1935,27 @@
                         <w:r>
                           <w:t xml:space="preserve">Figure </w:t>
                         </w:r>
-                        <w:fldSimple w:instr=" SEQ Figure \* ARABIC ">
-                          <w:r>
-                            <w:rPr>
-                              <w:noProof/>
-                            </w:rPr>
-                            <w:t>1</w:t>
-                          </w:r>
-                        </w:fldSimple>
+                        <w:r>
+                          <w:fldChar w:fldCharType="begin"/>
+                        </w:r>
+                        <w:r>
+                          <w:instrText xml:space="preserve"> SEQ Figure \* ARABIC </w:instrText>
+                        </w:r>
+                        <w:r>
+                          <w:fldChar w:fldCharType="separate"/>
+                        </w:r>
+                        <w:r>
+                          <w:rPr>
+                            <w:noProof/>
+                          </w:rPr>
+                          <w:t>1</w:t>
+                        </w:r>
+                        <w:r>
+                          <w:rPr>
+                            <w:noProof/>
+                          </w:rPr>
+                          <w:fldChar w:fldCharType="end"/>
+                        </w:r>
                         <w:r>
                           <w:t xml:space="preserve">. </w:t>
                         </w:r>
@@ -7221,14 +7234,27 @@
                         <w:r>
                           <w:t xml:space="preserve">Figure </w:t>
                         </w:r>
-                        <w:fldSimple w:instr=" SEQ Figure \* ARABIC ">
-                          <w:r>
-                            <w:rPr>
-                              <w:noProof/>
-                            </w:rPr>
-                            <w:t>4</w:t>
-                          </w:r>
-                        </w:fldSimple>
+                        <w:r>
+                          <w:fldChar w:fldCharType="begin"/>
+                        </w:r>
+                        <w:r>
+                          <w:instrText xml:space="preserve"> SEQ Figure \* ARABIC </w:instrText>
+                        </w:r>
+                        <w:r>
+                          <w:fldChar w:fldCharType="separate"/>
+                        </w:r>
+                        <w:r>
+                          <w:rPr>
+                            <w:noProof/>
+                          </w:rPr>
+                          <w:t>4</w:t>
+                        </w:r>
+                        <w:r>
+                          <w:rPr>
+                            <w:noProof/>
+                          </w:rPr>
+                          <w:fldChar w:fldCharType="end"/>
+                        </w:r>
                         <w:r>
                           <w:t xml:space="preserve">. Hallucination vs Prompt (All </w:t>
                         </w:r>
@@ -7559,14 +7585,27 @@
                         <w:r>
                           <w:t xml:space="preserve">Figure </w:t>
                         </w:r>
-                        <w:fldSimple w:instr=" SEQ Figure \* ARABIC ">
-                          <w:r>
-                            <w:rPr>
-                              <w:noProof/>
-                            </w:rPr>
-                            <w:t>2</w:t>
-                          </w:r>
-                        </w:fldSimple>
+                        <w:r>
+                          <w:fldChar w:fldCharType="begin"/>
+                        </w:r>
+                        <w:r>
+                          <w:instrText xml:space="preserve"> SEQ Figure \* ARABIC </w:instrText>
+                        </w:r>
+                        <w:r>
+                          <w:fldChar w:fldCharType="separate"/>
+                        </w:r>
+                        <w:r>
+                          <w:rPr>
+                            <w:noProof/>
+                          </w:rPr>
+                          <w:t>2</w:t>
+                        </w:r>
+                        <w:r>
+                          <w:rPr>
+                            <w:noProof/>
+                          </w:rPr>
+                          <w:fldChar w:fldCharType="end"/>
+                        </w:r>
                         <w:r>
                           <w:rPr>
                             <w:noProof/>
@@ -7641,14 +7680,27 @@
                         <w:r>
                           <w:t xml:space="preserve">Figure </w:t>
                         </w:r>
-                        <w:fldSimple w:instr=" SEQ Figure \* ARABIC ">
-                          <w:r>
-                            <w:rPr>
-                              <w:noProof/>
-                            </w:rPr>
-                            <w:t>3</w:t>
-                          </w:r>
-                        </w:fldSimple>
+                        <w:r>
+                          <w:fldChar w:fldCharType="begin"/>
+                        </w:r>
+                        <w:r>
+                          <w:instrText xml:space="preserve"> SEQ Figure \* ARABIC </w:instrText>
+                        </w:r>
+                        <w:r>
+                          <w:fldChar w:fldCharType="separate"/>
+                        </w:r>
+                        <w:r>
+                          <w:rPr>
+                            <w:noProof/>
+                          </w:rPr>
+                          <w:t>3</w:t>
+                        </w:r>
+                        <w:r>
+                          <w:rPr>
+                            <w:noProof/>
+                          </w:rPr>
+                          <w:fldChar w:fldCharType="end"/>
+                        </w:r>
                         <w:r>
                           <w:rPr>
                             <w:noProof/>
@@ -10726,14 +10778,27 @@
                         <w:r>
                           <w:t xml:space="preserve">Figure </w:t>
                         </w:r>
-                        <w:fldSimple w:instr=" SEQ Figure \* ARABIC ">
-                          <w:r>
-                            <w:rPr>
-                              <w:noProof/>
-                            </w:rPr>
-                            <w:t>5</w:t>
-                          </w:r>
-                        </w:fldSimple>
+                        <w:r>
+                          <w:fldChar w:fldCharType="begin"/>
+                        </w:r>
+                        <w:r>
+                          <w:instrText xml:space="preserve"> SEQ Figure \* ARABIC </w:instrText>
+                        </w:r>
+                        <w:r>
+                          <w:fldChar w:fldCharType="separate"/>
+                        </w:r>
+                        <w:r>
+                          <w:rPr>
+                            <w:noProof/>
+                          </w:rPr>
+                          <w:t>5</w:t>
+                        </w:r>
+                        <w:r>
+                          <w:rPr>
+                            <w:noProof/>
+                          </w:rPr>
+                          <w:fldChar w:fldCharType="end"/>
+                        </w:r>
                         <w:r>
                           <w:rPr>
                             <w:noProof/>
@@ -10892,14 +10957,27 @@
       <w:r>
         <w:t xml:space="preserve">Figure </w:t>
       </w:r>
-      <w:fldSimple w:instr=" SEQ Figure \* ARABIC ">
-        <w:r>
-          <w:rPr>
-            <w:noProof/>
-          </w:rPr>
-          <w:t>6</w:t>
-        </w:r>
-      </w:fldSimple>
+      <w:r>
+        <w:fldChar w:fldCharType="begin"/>
+      </w:r>
+      <w:r>
+        <w:instrText xml:space="preserve"> SEQ Figure \* ARABIC </w:instrText>
+      </w:r>
+      <w:r>
+        <w:fldChar w:fldCharType="separate"/>
+      </w:r>
+      <w:r>
+        <w:rPr>
+          <w:noProof/>
+        </w:rPr>
+        <w:t>6</w:t>
+      </w:r>
+      <w:r>
+        <w:rPr>
+          <w:noProof/>
+        </w:rPr>
+        <w:fldChar w:fldCharType="end"/>
+      </w:r>
       <w:r>
         <w:rPr>
           <w:noProof/>
@@ -15710,14 +15788,27 @@
       <w:r>
         <w:t xml:space="preserve">Figure </w:t>
       </w:r>
-      <w:fldSimple w:instr=" SEQ Figure \* ARABIC ">
-        <w:r>
-          <w:rPr>
-            <w:noProof/>
-          </w:rPr>
-          <w:t>7</w:t>
-        </w:r>
-      </w:fldSimple>
+      <w:r>
+        <w:fldChar w:fldCharType="begin"/>
+      </w:r>
+      <w:r>
+        <w:instrText xml:space="preserve"> SEQ Figure \* ARABIC </w:instrText>
+      </w:r>
+      <w:r>
+        <w:fldChar w:fldCharType="separate"/>
+      </w:r>
+      <w:r>
+        <w:rPr>
+          <w:noProof/>
+        </w:rPr>
+        <w:t>7</w:t>
+      </w:r>
+      <w:r>
+        <w:rPr>
+          <w:noProof/>
+        </w:rPr>
+        <w:fldChar w:fldCharType="end"/>
+      </w:r>
       <w:r>
         <w:t>. Full configuration performance range</w:t>
       </w:r>
@@ -15848,14 +15939,27 @@
                         <w:r>
                           <w:t xml:space="preserve">Figure </w:t>
                         </w:r>
-                        <w:fldSimple w:instr=" SEQ Figure \* ARABIC ">
-                          <w:r>
-                            <w:rPr>
-                              <w:noProof/>
-                            </w:rPr>
-                            <w:t>8</w:t>
-                          </w:r>
-                        </w:fldSimple>
+                        <w:r>
+                          <w:fldChar w:fldCharType="begin"/>
+                        </w:r>
+                        <w:r>
+                          <w:instrText xml:space="preserve"> SEQ Figure \* ARABIC </w:instrText>
+                        </w:r>
+                        <w:r>
+                          <w:fldChar w:fldCharType="separate"/>
+                        </w:r>
+                        <w:r>
+                          <w:rPr>
+                            <w:noProof/>
+                          </w:rPr>
+                          <w:t>8</w:t>
+                        </w:r>
+                        <w:r>
+                          <w:rPr>
+                            <w:noProof/>
+                          </w:rPr>
+                          <w:fldChar w:fldCharType="end"/>
+                        </w:r>
                         <w:r>
                           <w:t>. Noise Injection – F1 vs hallucination rate (Gemma 3:12b only)</w:t>
                         </w:r>
@@ -16085,15 +16189,7 @@
           <w:sz w:val="20"/>
           <w:szCs w:val="20"/>
         </w:rPr>
-        <w:t xml:space="preserve">36 core and 324 extended RAGs were used for experiments. F1 for 256 tokens is 4.7%–6.9% smaller than for 128 tokens (4.7–6.9%). k = 3–5 is the depth of retrieval. Cross-encoder reranking seems to improve this F1 at low k; standard prompts increase the maximum level of F1 for tokens, but strict prompts lower the hallucination level; random noise injection with strict prompts unexpectedly increases F1 to 0.748, the maximum F1 in the study; Gemma 3:12b </w:t>
-      </w:r>
-      <w:r>
-        <w:rPr>
-          <w:sz w:val="20"/>
-          <w:szCs w:val="20"/>
-        </w:rPr>
-        <w:lastRenderedPageBreak/>
-        <w:t>outperformed LLaMA 3.2:3b in the pilot study, suggesting that scale is an important aspect of extractive RAG performance.</w:t>
+        <w:t>36 core and 324 extended RAGs were used for experiments. F1 for 256 tokens is 4.7%–6.9% smaller than for 128 tokens (4.7–6.9%). k = 3–5 is the depth of retrieval. Cross-encoder reranking seems to improve this F1 at low k; standard prompts increase the maximum level of F1 for tokens, but strict prompts lower the hallucination level; random noise injection with strict prompts unexpectedly increases F1 to 0.748, the maximum F1 in the study; Gemma 3:12b outperformed LLaMA 3.2:3b in the pilot study, suggesting that scale is an important aspect of extractive RAG performance.</w:t>
       </w:r>
     </w:p>
     <w:p>
@@ -16124,6 +16220,7 @@
         </w:rPr>
       </w:pPr>
       <w:r>
+        <w:lastRenderedPageBreak/>
         <w:drawing>
           <wp:anchor distT="0" distB="0" distL="114300" distR="114300" simplePos="0" relativeHeight="251694592" behindDoc="0" locked="0" layoutInCell="1" allowOverlap="1" wp14:anchorId="22DD4CA0" wp14:editId="77A65DDD">
             <wp:simplePos x="0" y="0"/>
@@ -16171,14 +16268,27 @@
                         <w:r>
                           <w:t xml:space="preserve">Figure </w:t>
                         </w:r>
-                        <w:fldSimple w:instr=" SEQ Figure \* ARABIC ">
-                          <w:r>
-                            <w:rPr>
-                              <w:noProof/>
-                            </w:rPr>
-                            <w:t>8</w:t>
-                          </w:r>
-                        </w:fldSimple>
+                        <w:r>
+                          <w:fldChar w:fldCharType="begin"/>
+                        </w:r>
+                        <w:r>
+                          <w:instrText xml:space="preserve"> SEQ Figure \* ARABIC </w:instrText>
+                        </w:r>
+                        <w:r>
+                          <w:fldChar w:fldCharType="separate"/>
+                        </w:r>
+                        <w:r>
+                          <w:rPr>
+                            <w:noProof/>
+                          </w:rPr>
+                          <w:t>8</w:t>
+                        </w:r>
+                        <w:r>
+                          <w:rPr>
+                            <w:noProof/>
+                          </w:rPr>
+                          <w:fldChar w:fldCharType="end"/>
+                        </w:r>
                         <w:r>
                           <w:t>. Noise Injection – F1 vs hallucination rate (Gemma 3:12b only)</w:t>
                         </w:r>
@@ -16203,6 +16313,134 @@
           <w:szCs w:val="20"/>
         </w:rPr>
         <w:t>The proposed framework will also be extended to include the full suite of SQuAD validations and multi-domain benchmarks (TriviaQA, Natural Questions, HotpotQA); evaluation of the 7B-70B parameter models to investigate the relationship between scale and depth of retrieval; consideration of semantic similarity and LLM-as-a-judge faithfulness scores; exploration of semantic and recursive chunking as an alternative to fixed-size chunking; and assessment of adaptive retrieval policies that change k according query complexity and retrieval confidence.</w:t>
+      </w:r>
+    </w:p>
+    <w:p>
+      <w:pPr>
+        <w:pStyle w:val="references"/>
+        <w:numPr>
+          <w:ilvl w:val="0"/>
+          <w:numId w:val="0"/>
+        </w:numPr>
+        <w:spacing w:line="12pt" w:lineRule="auto"/>
+        <w:rPr>
+          <w:sz w:val="20"/>
+          <w:szCs w:val="20"/>
+        </w:rPr>
+      </w:pPr>
+    </w:p>
+    <w:p>
+      <w:pPr>
+        <w:pStyle w:val="references"/>
+        <w:numPr>
+          <w:ilvl w:val="0"/>
+          <w:numId w:val="0"/>
+        </w:numPr>
+        <w:spacing w:line="12pt" w:lineRule="auto"/>
+        <w:rPr>
+          <w:sz w:val="20"/>
+          <w:szCs w:val="20"/>
+        </w:rPr>
+      </w:pPr>
+      <w:r>
+        <w:rPr>
+          <w:sz w:val="20"/>
+          <w:szCs w:val="20"/>
+        </w:rPr>
+        <w:tab/>
+      </w:r>
+      <w:r>
+        <w:rPr>
+          <w:sz w:val="20"/>
+          <w:szCs w:val="20"/>
+        </w:rPr>
+        <w:tab/>
+        <w:t>COMPETING INTERESTS</w:t>
+      </w:r>
+    </w:p>
+    <w:p>
+      <w:pPr>
+        <w:pStyle w:val="references"/>
+        <w:numPr>
+          <w:ilvl w:val="0"/>
+          <w:numId w:val="0"/>
+        </w:numPr>
+        <w:spacing w:line="12pt" w:lineRule="auto"/>
+        <w:rPr>
+          <w:sz w:val="20"/>
+          <w:szCs w:val="20"/>
+        </w:rPr>
+      </w:pPr>
+      <w:r>
+        <w:rPr>
+          <w:sz w:val="20"/>
+          <w:szCs w:val="20"/>
+        </w:rPr>
+        <w:t>The authors declare that they have no known competing financial interests or personal relationships that could have appeared to influence the work reported in this paper.</w:t>
+      </w:r>
+    </w:p>
+    <w:p>
+      <w:pPr>
+        <w:pStyle w:val="references"/>
+        <w:numPr>
+          <w:ilvl w:val="0"/>
+          <w:numId w:val="0"/>
+        </w:numPr>
+        <w:spacing w:line="12pt" w:lineRule="auto"/>
+        <w:rPr>
+          <w:sz w:val="20"/>
+          <w:szCs w:val="20"/>
+        </w:rPr>
+      </w:pPr>
+    </w:p>
+    <w:p>
+      <w:pPr>
+        <w:pStyle w:val="references"/>
+        <w:numPr>
+          <w:ilvl w:val="0"/>
+          <w:numId w:val="0"/>
+        </w:numPr>
+        <w:spacing w:line="12pt" w:lineRule="auto"/>
+        <w:rPr>
+          <w:sz w:val="20"/>
+          <w:szCs w:val="20"/>
+        </w:rPr>
+      </w:pPr>
+      <w:r>
+        <w:rPr>
+          <w:sz w:val="20"/>
+          <w:szCs w:val="20"/>
+        </w:rPr>
+        <w:tab/>
+      </w:r>
+      <w:r>
+        <w:rPr>
+          <w:sz w:val="20"/>
+          <w:szCs w:val="20"/>
+        </w:rPr>
+        <w:tab/>
+        <w:t>ACKNOWLEDGEMENT</w:t>
+      </w:r>
+    </w:p>
+    <w:p>
+      <w:pPr>
+        <w:pStyle w:val="references"/>
+        <w:numPr>
+          <w:ilvl w:val="0"/>
+          <w:numId w:val="0"/>
+        </w:numPr>
+        <w:spacing w:line="12pt" w:lineRule="auto"/>
+        <w:rPr>
+          <w:sz w:val="20"/>
+          <w:szCs w:val="20"/>
+        </w:rPr>
+      </w:pPr>
+      <w:r>
+        <w:rPr>
+          <w:sz w:val="20"/>
+          <w:szCs w:val="20"/>
+        </w:rPr>
+        <w:t>The authors acknowledge that there has been no financial support for this work that could have influenced its outcome. The authors would like to thank the Editor-in-Chief, section editors, and anonymous reviewers for their comments and suggestions that helped to improve the quality of this work.</w:t>
       </w:r>
     </w:p>
     <w:p>
@@ -20413,7 +20651,7 @@
 </file>
 
 <file path=customXml/itemProps1.xml><?xml version="1.0" encoding="utf-8"?>
-<ds:datastoreItem xmlns:ds="http://purl.oclc.org/ooxml/officeDocument/customXml" ds:itemID="{2A8922C6-C242-4AB9-8A15-C3E94772D434}">
+<ds:datastoreItem xmlns:ds="http://purl.oclc.org/ooxml/officeDocument/customXml" ds:itemID="{52EC8B73-1985-4CEC-AC25-0CC9AF360621}">
   <ds:schemaRefs>
     <ds:schemaRef ds:uri="http://schemas.openxmlformats.org/officeDocument/2006/bibliography"/>
   </ds:schemaRefs>

</xml_diff>